<commit_message>
Update Developer Manual and Diagrams
</commit_message>
<xml_diff>
--- a/Documentation/Developer_Manual_ForensicWhisperDeskZH.docx
+++ b/Documentation/Developer_Manual_ForensicWhisperDeskZH.docx
@@ -759,7 +759,6 @@
                                   <w:lang w:val="de-CH"/>
                                 </w:rPr>
                               </w:pPr>
-                              <w:proofErr w:type="spellStart"/>
                               <w:r>
                                 <w:rPr>
                                   <w:color w:val="595959" w:themeColor="text1" w:themeTint="A6"/>
@@ -769,7 +768,6 @@
                                 </w:rPr>
                                 <w:t>ForMaLTeC</w:t>
                               </w:r>
-                              <w:proofErr w:type="spellEnd"/>
                             </w:p>
                           </w:sdtContent>
                         </w:sdt>
@@ -3081,12 +3079,21 @@
       </w:r>
     </w:p>
     <w:p>
+      <w:proofErr w:type="spellStart"/>
       <w:r>
         <w:rPr>
           <w:b/>
           <w:bCs/>
         </w:rPr>
-        <w:t>Arbeitspeicherpeicher:</w:t>
+        <w:t>Arbeitspeicherpeicher</w:t>
+      </w:r>
+      <w:proofErr w:type="spellEnd"/>
+      <w:r>
+        <w:rPr>
+          <w:b/>
+          <w:bCs/>
+        </w:rPr>
+        <w:t>:</w:t>
       </w:r>
       <w:r>
         <w:t xml:space="preserve"> 8GB RAM</w:t>
@@ -3163,12 +3170,21 @@
       </w:r>
     </w:p>
     <w:p>
+      <w:proofErr w:type="spellStart"/>
       <w:r>
         <w:rPr>
           <w:b/>
           <w:bCs/>
         </w:rPr>
-        <w:t>Arbeitspeicherpeicher:</w:t>
+        <w:t>Arbeitspeicherpeicher</w:t>
+      </w:r>
+      <w:proofErr w:type="spellEnd"/>
+      <w:r>
+        <w:rPr>
+          <w:b/>
+          <w:bCs/>
+        </w:rPr>
+        <w:t>:</w:t>
       </w:r>
       <w:r>
         <w:t xml:space="preserve"> 16 GB RAM</w:t>
@@ -3235,7 +3251,15 @@
         <w:t xml:space="preserve">VSTO: </w:t>
       </w:r>
       <w:r>
-        <w:t xml:space="preserve">Visual Studio Tools for Office, erlaubt die Integration von Ribbon Add-Ins direkt in Office Programme. </w:t>
+        <w:t xml:space="preserve">Visual Studio Tools </w:t>
+      </w:r>
+      <w:proofErr w:type="spellStart"/>
+      <w:r>
+        <w:t>for</w:t>
+      </w:r>
+      <w:proofErr w:type="spellEnd"/>
+      <w:r>
+        <w:t xml:space="preserve"> Office, erlaubt die Integration von Ribbon Add-Ins direkt in Office Programme. </w:t>
       </w:r>
       <w:r>
         <w:rPr>
@@ -3250,7 +3274,17 @@
     </w:p>
     <w:p>
       <w:r>
-        <w:t>(Stand:August, 2025)</w:t>
+        <w:t>(</w:t>
+      </w:r>
+      <w:proofErr w:type="spellStart"/>
+      <w:proofErr w:type="gramStart"/>
+      <w:r>
+        <w:t>Stand:August</w:t>
+      </w:r>
+      <w:proofErr w:type="spellEnd"/>
+      <w:proofErr w:type="gramEnd"/>
+      <w:r>
+        <w:t>, 2025)</w:t>
       </w:r>
     </w:p>
     <w:p>
@@ -3261,6 +3295,7 @@
         </w:rPr>
       </w:pPr>
       <w:bookmarkStart w:id="7" w:name="_Toc207199919"/>
+      <w:proofErr w:type="spellStart"/>
       <w:r>
         <w:rPr>
           <w:lang w:val="de-CH"/>
@@ -3269,6 +3304,7 @@
         <w:t>Techstack</w:t>
       </w:r>
       <w:bookmarkEnd w:id="7"/>
+      <w:proofErr w:type="spellEnd"/>
     </w:p>
     <w:p>
       <w:pPr>
@@ -3293,7 +3329,62 @@
           <w:b/>
           <w:bCs/>
         </w:rPr>
-        <w:t>Framework: .Net Framework 4.8 &amp; VSTO</w:t>
+        <w:t>Framework:</w:t>
+      </w:r>
+    </w:p>
+    <w:p>
+      <w:pPr>
+        <w:pStyle w:val="ListParagraph"/>
+        <w:numPr>
+          <w:ilvl w:val="1"/>
+          <w:numId w:val="20"/>
+        </w:numPr>
+      </w:pPr>
+      <w:r>
+        <w:rPr>
+          <w:b/>
+          <w:bCs/>
+        </w:rPr>
+        <w:t xml:space="preserve"> .Net Framework 4.8 &amp; VSTO</w:t>
+      </w:r>
+      <w:r>
+        <w:rPr>
+          <w:b/>
+          <w:bCs/>
+        </w:rPr>
+        <w:t xml:space="preserve"> (Add-In)</w:t>
+      </w:r>
+    </w:p>
+    <w:p>
+      <w:pPr>
+        <w:pStyle w:val="ListParagraph"/>
+        <w:numPr>
+          <w:ilvl w:val="1"/>
+          <w:numId w:val="20"/>
+        </w:numPr>
+      </w:pPr>
+      <w:r>
+        <w:rPr>
+          <w:b/>
+          <w:bCs/>
+        </w:rPr>
+        <w:t>.Net 9.0 (</w:t>
+      </w:r>
+      <w:proofErr w:type="spellStart"/>
+      <w:r>
+        <w:rPr>
+          <w:b/>
+          <w:bCs/>
+        </w:rPr>
+        <w:t>ModelDownloader</w:t>
+      </w:r>
+      <w:proofErr w:type="spellEnd"/>
+      <w:r>
+        <w:rPr>
+          <w:b/>
+          <w:bCs/>
+        </w:rPr>
+        <w:t>)</w:t>
       </w:r>
     </w:p>
     <w:p>
@@ -3317,8 +3408,21 @@
         <w:pStyle w:val="Heading2"/>
       </w:pPr>
       <w:bookmarkStart w:id="9" w:name="_Toc207199921"/>
-      <w:r>
-        <w:t>Nuget Packete:</w:t>
+      <w:proofErr w:type="spellStart"/>
+      <w:r>
+        <w:t>Nuget</w:t>
+      </w:r>
+      <w:proofErr w:type="spellEnd"/>
+      <w:r>
+        <w:t xml:space="preserve"> </w:t>
+      </w:r>
+      <w:proofErr w:type="spellStart"/>
+      <w:r>
+        <w:t>Packete</w:t>
+      </w:r>
+      <w:proofErr w:type="spellEnd"/>
+      <w:r>
+        <w:t>:</w:t>
       </w:r>
       <w:bookmarkEnd w:id="9"/>
     </w:p>
@@ -3350,10 +3454,98 @@
         </w:rPr>
       </w:pPr>
       <w:r>
-        <w:t>Whisper.net ist ein von Sandro Hanea entwickeltes Nuget package welches Platform übergreifendes Interfaces  für .Net Sprachen und Frameworks zur Verfügung stellt.</w:t>
-      </w:r>
-      <w:r>
-        <w:t xml:space="preserve"> Im ForensicWhisperDeskZH nutzt diese Interfaces als Kern der Transkriptionsengine. Whisper.Net stellt Runtimes für Cuda, Vulkan, OpenVino und CPU Backends zur Verfügung.</w:t>
+        <w:t xml:space="preserve">Whisper.net ist ein von Sandro </w:t>
+      </w:r>
+      <w:proofErr w:type="spellStart"/>
+      <w:r>
+        <w:t>Hanea</w:t>
+      </w:r>
+      <w:proofErr w:type="spellEnd"/>
+      <w:r>
+        <w:t xml:space="preserve"> entwickeltes </w:t>
+      </w:r>
+      <w:proofErr w:type="spellStart"/>
+      <w:r>
+        <w:t>Nuget</w:t>
+      </w:r>
+      <w:proofErr w:type="spellEnd"/>
+      <w:r>
+        <w:t xml:space="preserve"> </w:t>
+      </w:r>
+      <w:proofErr w:type="spellStart"/>
+      <w:r>
+        <w:t>package</w:t>
+      </w:r>
+      <w:proofErr w:type="spellEnd"/>
+      <w:r>
+        <w:t xml:space="preserve"> welches </w:t>
+      </w:r>
+      <w:proofErr w:type="spellStart"/>
+      <w:r>
+        <w:t>Platform</w:t>
+      </w:r>
+      <w:proofErr w:type="spellEnd"/>
+      <w:r>
+        <w:t xml:space="preserve"> übergreifendes </w:t>
+      </w:r>
+      <w:proofErr w:type="gramStart"/>
+      <w:r>
+        <w:t>Interfaces  für</w:t>
+      </w:r>
+      <w:proofErr w:type="gramEnd"/>
+      <w:r>
+        <w:t xml:space="preserve"> .Net Sprachen und Frameworks zur Verfügung stellt.</w:t>
+      </w:r>
+      <w:r>
+        <w:t xml:space="preserve"> Im </w:t>
+      </w:r>
+      <w:proofErr w:type="spellStart"/>
+      <w:r>
+        <w:t>ForensicWhisperDeskZH</w:t>
+      </w:r>
+      <w:proofErr w:type="spellEnd"/>
+      <w:r>
+        <w:t xml:space="preserve"> nutzt diese Interfaces als Kern der </w:t>
+      </w:r>
+      <w:proofErr w:type="spellStart"/>
+      <w:r>
+        <w:t>Transkriptionsengine</w:t>
+      </w:r>
+      <w:proofErr w:type="spellEnd"/>
+      <w:r>
+        <w:t xml:space="preserve">. Whisper.Net stellt </w:t>
+      </w:r>
+      <w:proofErr w:type="spellStart"/>
+      <w:r>
+        <w:t>Runtimes</w:t>
+      </w:r>
+      <w:proofErr w:type="spellEnd"/>
+      <w:r>
+        <w:t xml:space="preserve"> für </w:t>
+      </w:r>
+      <w:proofErr w:type="spellStart"/>
+      <w:r>
+        <w:t>Cuda</w:t>
+      </w:r>
+      <w:proofErr w:type="spellEnd"/>
+      <w:r>
+        <w:t xml:space="preserve">, Vulkan, </w:t>
+      </w:r>
+      <w:proofErr w:type="spellStart"/>
+      <w:r>
+        <w:t>OpenVino</w:t>
+      </w:r>
+      <w:proofErr w:type="spellEnd"/>
+      <w:r>
+        <w:t xml:space="preserve"> und CPU </w:t>
+      </w:r>
+      <w:proofErr w:type="spellStart"/>
+      <w:r>
+        <w:t>Backends</w:t>
+      </w:r>
+      <w:proofErr w:type="spellEnd"/>
+      <w:r>
+        <w:t xml:space="preserve"> zur Verfügung.</w:t>
       </w:r>
     </w:p>
     <w:p>
@@ -3364,6 +3556,7 @@
           <w:numId w:val="21"/>
         </w:numPr>
       </w:pPr>
+      <w:proofErr w:type="spellStart"/>
       <w:r>
         <w:rPr>
           <w:b/>
@@ -3371,10 +3564,64 @@
         </w:rPr>
         <w:t>NAudio</w:t>
       </w:r>
+      <w:proofErr w:type="spellEnd"/>
     </w:p>
     <w:p>
-      <w:r>
-        <w:t>NAudio ist eine .Net Audiobibliothek welche der Kern der Audioaufnahmefähigkeiten des ForensicWhisperDeskZH bildet. Das AddIn nutzt die Implementation der WASAPI(Windows Audio Session API) welche von Naudio zur Verfügung gestellt wird.</w:t>
+      <w:proofErr w:type="spellStart"/>
+      <w:r>
+        <w:t>NAudio</w:t>
+      </w:r>
+      <w:proofErr w:type="spellEnd"/>
+      <w:r>
+        <w:t xml:space="preserve"> ist eine .Net </w:t>
+      </w:r>
+      <w:proofErr w:type="gramStart"/>
+      <w:r>
+        <w:t>Audiobibliothek</w:t>
+      </w:r>
+      <w:proofErr w:type="gramEnd"/>
+      <w:r>
+        <w:t xml:space="preserve"> welche der Kern der Audioaufnahmefähigkeiten des </w:t>
+      </w:r>
+      <w:proofErr w:type="spellStart"/>
+      <w:r>
+        <w:t>ForensicWhisperDeskZH</w:t>
+      </w:r>
+      <w:proofErr w:type="spellEnd"/>
+      <w:r>
+        <w:t xml:space="preserve"> bildet. Das </w:t>
+      </w:r>
+      <w:proofErr w:type="spellStart"/>
+      <w:r>
+        <w:t>AddIn</w:t>
+      </w:r>
+      <w:proofErr w:type="spellEnd"/>
+      <w:r>
+        <w:t xml:space="preserve"> nutzt die Implementation der </w:t>
+      </w:r>
+      <w:proofErr w:type="gramStart"/>
+      <w:r>
+        <w:t>WASAPI(</w:t>
+      </w:r>
+      <w:proofErr w:type="gramEnd"/>
+      <w:r>
+        <w:t xml:space="preserve">Windows Audio Session </w:t>
+      </w:r>
+      <w:proofErr w:type="gramStart"/>
+      <w:r>
+        <w:t>API)</w:t>
+      </w:r>
+      <w:proofErr w:type="gramEnd"/>
+      <w:r>
+        <w:t xml:space="preserve"> welche von </w:t>
+      </w:r>
+      <w:proofErr w:type="spellStart"/>
+      <w:r>
+        <w:t>Naudio</w:t>
+      </w:r>
+      <w:proofErr w:type="spellEnd"/>
+      <w:r>
+        <w:t xml:space="preserve"> zur Verfügung gestellt wird.</w:t>
       </w:r>
     </w:p>
     <w:p>
@@ -3389,6 +3636,7 @@
           <w:bCs/>
         </w:rPr>
       </w:pPr>
+      <w:proofErr w:type="spellStart"/>
       <w:r>
         <w:rPr>
           <w:b/>
@@ -3396,10 +3644,53 @@
         </w:rPr>
         <w:t>WebRtcVadSharp</w:t>
       </w:r>
+      <w:proofErr w:type="spellEnd"/>
     </w:p>
     <w:p>
-      <w:r>
-        <w:t>WebRtcVadSharp ist ein .NET-Wrapper für die WebRTC Voice Activity Detection (VAD)-Bibliothek von Google, welche innerhalb dieses AddIns zur Optimierung der Audioverarbeitungs  genutzt wird.</w:t>
+      <w:proofErr w:type="spellStart"/>
+      <w:r>
+        <w:t>WebRtcVadSharp</w:t>
+      </w:r>
+      <w:proofErr w:type="spellEnd"/>
+      <w:r>
+        <w:t xml:space="preserve"> ist ein .NET-Wrapper für die WebRTC Voice </w:t>
+      </w:r>
+      <w:proofErr w:type="spellStart"/>
+      <w:r>
+        <w:t>Activity</w:t>
+      </w:r>
+      <w:proofErr w:type="spellEnd"/>
+      <w:r>
+        <w:t xml:space="preserve"> </w:t>
+      </w:r>
+      <w:proofErr w:type="spellStart"/>
+      <w:r>
+        <w:t>Detection</w:t>
+      </w:r>
+      <w:proofErr w:type="spellEnd"/>
+      <w:r>
+        <w:t xml:space="preserve"> (VAD)-Bibliothek von Google, welche innerhalb dieses </w:t>
+      </w:r>
+      <w:proofErr w:type="spellStart"/>
+      <w:r>
+        <w:t>AddIns</w:t>
+      </w:r>
+      <w:proofErr w:type="spellEnd"/>
+      <w:r>
+        <w:t xml:space="preserve"> zur Optimierung der </w:t>
+      </w:r>
+      <w:proofErr w:type="spellStart"/>
+      <w:proofErr w:type="gramStart"/>
+      <w:r>
+        <w:t>Audioverarbeitungs</w:t>
+      </w:r>
+      <w:proofErr w:type="spellEnd"/>
+      <w:r>
+        <w:t xml:space="preserve">  genutzt</w:t>
+      </w:r>
+      <w:proofErr w:type="gramEnd"/>
+      <w:r>
+        <w:t xml:space="preserve"> wird.</w:t>
       </w:r>
     </w:p>
     <w:p>
@@ -3435,25 +3726,66 @@
       <w:r>
         <w:t xml:space="preserve">, </w:t>
       </w:r>
+      <w:proofErr w:type="spellStart"/>
       <w:r>
         <w:rPr>
           <w:b/>
           <w:bCs/>
         </w:rPr>
-        <w:t xml:space="preserve">ForensicWhisperDeskZH </w:t>
-      </w:r>
-      <w:r>
-        <w:t xml:space="preserve">(Das eigentliche AddIn) </w:t>
-      </w:r>
+        <w:t>ForensicWhisperDeskZH</w:t>
+      </w:r>
+      <w:proofErr w:type="spellEnd"/>
       <w:r>
         <w:rPr>
           <w:b/>
           <w:bCs/>
         </w:rPr>
-        <w:t>&amp; ModelDownloader (</w:t>
-      </w:r>
-      <w:r>
-        <w:t xml:space="preserve">Hilfsprojekt für das Builden mit Jobs). </w:t>
+        <w:t xml:space="preserve"> </w:t>
+      </w:r>
+      <w:r>
+        <w:t xml:space="preserve">(Das eigentliche </w:t>
+      </w:r>
+      <w:proofErr w:type="spellStart"/>
+      <w:r>
+        <w:t>AddIn</w:t>
+      </w:r>
+      <w:proofErr w:type="spellEnd"/>
+      <w:r>
+        <w:t xml:space="preserve">) </w:t>
+      </w:r>
+      <w:r>
+        <w:rPr>
+          <w:b/>
+          <w:bCs/>
+        </w:rPr>
+        <w:t xml:space="preserve">&amp; </w:t>
+      </w:r>
+      <w:proofErr w:type="spellStart"/>
+      <w:r>
+        <w:rPr>
+          <w:b/>
+          <w:bCs/>
+        </w:rPr>
+        <w:t>ModelDownloader</w:t>
+      </w:r>
+      <w:proofErr w:type="spellEnd"/>
+      <w:r>
+        <w:rPr>
+          <w:b/>
+          <w:bCs/>
+        </w:rPr>
+        <w:t xml:space="preserve"> (</w:t>
+      </w:r>
+      <w:r>
+        <w:t xml:space="preserve">Hilfsprojekt für das </w:t>
+      </w:r>
+      <w:proofErr w:type="spellStart"/>
+      <w:r>
+        <w:t>Builden</w:t>
+      </w:r>
+      <w:proofErr w:type="spellEnd"/>
+      <w:r>
+        <w:t xml:space="preserve"> mit Jobs). </w:t>
       </w:r>
       <w:r>
         <w:t xml:space="preserve">Dazukommen die </w:t>
@@ -3466,14 +3798,55 @@
         <w:t xml:space="preserve">Keywords.xml </w:t>
       </w:r>
       <w:r>
-        <w:t xml:space="preserve">Datei und das Job Script für die Github Actions; </w:t>
-      </w:r>
+        <w:t xml:space="preserve">Datei und das Job </w:t>
+      </w:r>
+      <w:proofErr w:type="spellStart"/>
+      <w:r>
+        <w:t>Script</w:t>
+      </w:r>
+      <w:proofErr w:type="spellEnd"/>
+      <w:r>
+        <w:t xml:space="preserve"> für die </w:t>
+      </w:r>
+      <w:proofErr w:type="spellStart"/>
+      <w:r>
+        <w:t>Github</w:t>
+      </w:r>
+      <w:proofErr w:type="spellEnd"/>
+      <w:r>
+        <w:t xml:space="preserve"> Actions; </w:t>
+      </w:r>
+      <w:proofErr w:type="spellStart"/>
       <w:r>
         <w:rPr>
           <w:b/>
           <w:bCs/>
         </w:rPr>
-        <w:t xml:space="preserve">build-and-publish-vsto.yml </w:t>
+        <w:t>build</w:t>
+      </w:r>
+      <w:proofErr w:type="spellEnd"/>
+      <w:r>
+        <w:rPr>
+          <w:b/>
+          <w:bCs/>
+        </w:rPr>
+        <w:t>-and-publish-</w:t>
+      </w:r>
+      <w:proofErr w:type="spellStart"/>
+      <w:r>
+        <w:rPr>
+          <w:b/>
+          <w:bCs/>
+        </w:rPr>
+        <w:t>vsto.yml</w:t>
+      </w:r>
+      <w:proofErr w:type="spellEnd"/>
+      <w:r>
+        <w:rPr>
+          <w:b/>
+          <w:bCs/>
+        </w:rPr>
+        <w:t xml:space="preserve"> </w:t>
       </w:r>
     </w:p>
     <w:p>
@@ -3486,6 +3859,7 @@
         </w:rPr>
       </w:pPr>
       <w:bookmarkStart w:id="12" w:name="_Toc207199924"/>
+      <w:proofErr w:type="spellStart"/>
       <w:r>
         <w:rPr>
           <w:rStyle w:val="Strong"/>
@@ -3494,6 +3868,7 @@
         </w:rPr>
         <w:t>ForensicWhisperDeskZH</w:t>
       </w:r>
+      <w:proofErr w:type="spellEnd"/>
       <w:r>
         <w:rPr>
           <w:rStyle w:val="Strong"/>
@@ -3505,8 +3880,41 @@
       <w:bookmarkEnd w:id="12"/>
     </w:p>
     <w:p>
-      <w:r>
-        <w:t>Dieses Projekt ist das eigentliche VSTO AddIn. Es stellt dem User das Interface sowie die Transkriptionsfunktionalität zur Verfügung. Sämtliche Features sind hier enthalten. Zur Interaktion</w:t>
+      <w:pPr>
+        <w:rPr>
+          <w:b/>
+          <w:bCs/>
+        </w:rPr>
+      </w:pPr>
+      <w:r>
+        <w:t xml:space="preserve">Dieses Projekt ist das eigentliche VSTO </w:t>
+      </w:r>
+      <w:proofErr w:type="spellStart"/>
+      <w:r>
+        <w:t>AddIn</w:t>
+      </w:r>
+      <w:proofErr w:type="spellEnd"/>
+      <w:r>
+        <w:t>. Es stellt dem User das Interface sowie die Transkriptionsfunktionalität zur Verfügung. Sämtliche Features sind hier enthalten. Zur Interaktion</w:t>
+      </w:r>
+      <w:r>
+        <w:t xml:space="preserve"> wird Microsoft Word das </w:t>
+      </w:r>
+      <w:proofErr w:type="spellStart"/>
+      <w:r>
+        <w:rPr>
+          <w:b/>
+          <w:bCs/>
+        </w:rPr>
+        <w:t>MainRibbon.cs</w:t>
+      </w:r>
+      <w:proofErr w:type="spellEnd"/>
+      <w:r>
+        <w:rPr>
+          <w:b/>
+          <w:bCs/>
+        </w:rPr>
+        <w:t xml:space="preserve"> Ribbon verwendet.</w:t>
       </w:r>
     </w:p>
     <w:p>
@@ -3519,6 +3927,7 @@
         </w:rPr>
       </w:pPr>
       <w:bookmarkStart w:id="13" w:name="_Toc207199925"/>
+      <w:proofErr w:type="spellStart"/>
       <w:r>
         <w:rPr>
           <w:rStyle w:val="Strong"/>
@@ -3528,6 +3937,7 @@
         <w:lastRenderedPageBreak/>
         <w:t>ModelDownloader</w:t>
       </w:r>
+      <w:proofErr w:type="spellEnd"/>
       <w:r>
         <w:rPr>
           <w:rStyle w:val="Strong"/>
@@ -3540,7 +3950,39 @@
     </w:p>
     <w:p>
       <w:r>
-        <w:t>Das ModelDownloader Project ist ein Utility Project und wird nicht grundsätzlich für das AddIn benötigt. Es dient dazu die Modelle automatisiert herunterladen zu können und kann lokal ausgeführt werden, ist aber hauptsächlich dazu da die WhisperAI Modelle für den Build Prozess in GitHub Actions zur Verfügung zu stellen</w:t>
+        <w:t xml:space="preserve">Das </w:t>
+      </w:r>
+      <w:proofErr w:type="spellStart"/>
+      <w:r>
+        <w:t>ModelDownloader</w:t>
+      </w:r>
+      <w:proofErr w:type="spellEnd"/>
+      <w:r>
+        <w:t xml:space="preserve"> Project ist ein Utility Project und wird nicht grundsätzlich für das </w:t>
+      </w:r>
+      <w:proofErr w:type="spellStart"/>
+      <w:r>
+        <w:t>AddIn</w:t>
+      </w:r>
+      <w:proofErr w:type="spellEnd"/>
+      <w:r>
+        <w:t xml:space="preserve"> benötigt. Es dient dazu die Modelle automatisiert herunterladen zu können und kann lokal ausgeführt werden, ist aber hauptsächlich dazu da die </w:t>
+      </w:r>
+      <w:proofErr w:type="spellStart"/>
+      <w:r>
+        <w:t>WhisperAI</w:t>
+      </w:r>
+      <w:proofErr w:type="spellEnd"/>
+      <w:r>
+        <w:t xml:space="preserve"> Modelle für den </w:t>
+      </w:r>
+      <w:proofErr w:type="spellStart"/>
+      <w:r>
+        <w:t>Build</w:t>
+      </w:r>
+      <w:proofErr w:type="spellEnd"/>
+      <w:r>
+        <w:t xml:space="preserve"> Prozess in GitHub Actions zur Verfügung zu stellen</w:t>
       </w:r>
       <w:r>
         <w:t>.</w:t>
@@ -3558,9 +4000,17 @@
         <w:rPr>
           <w:lang w:val="de-CH"/>
         </w:rPr>
-        <w:t>Architektur ForensicWhisperDeskZH</w:t>
+        <w:t xml:space="preserve">Architektur </w:t>
+      </w:r>
+      <w:proofErr w:type="spellStart"/>
+      <w:r>
+        <w:rPr>
+          <w:lang w:val="de-CH"/>
+        </w:rPr>
+        <w:t>ForensicWhisperDeskZH</w:t>
       </w:r>
       <w:bookmarkEnd w:id="14"/>
+      <w:proofErr w:type="spellEnd"/>
     </w:p>
     <w:p>
       <w:pPr>
@@ -3574,7 +4024,39 @@
     </w:p>
     <w:p>
       <w:r>
-        <w:t>Das ForensicWhisperDeskZH-Projekt ist das Hauptprojekt der Solution und implementiert ein vollständiges VSTO (Visual Studio Tools for Office) Add-In für Microsoft Word. Es stellt eine umfassende Spracherkennungs- und Transkriptionslösung bereit, die auf OpenAI's Whisper-Technologie basiert und nahtlos in die Word-Benutzeroberfläche integriert ist.</w:t>
+        <w:t xml:space="preserve">Das </w:t>
+      </w:r>
+      <w:proofErr w:type="spellStart"/>
+      <w:r>
+        <w:t>ForensicWhisperDeskZH</w:t>
+      </w:r>
+      <w:proofErr w:type="spellEnd"/>
+      <w:r>
+        <w:t xml:space="preserve">-Projekt ist das Hauptprojekt der Solution und implementiert ein vollständiges VSTO (Visual Studio Tools </w:t>
+      </w:r>
+      <w:proofErr w:type="spellStart"/>
+      <w:r>
+        <w:t>for</w:t>
+      </w:r>
+      <w:proofErr w:type="spellEnd"/>
+      <w:r>
+        <w:t xml:space="preserve"> Office) Add-In für Microsoft Word. Es stellt eine umfassende Spracherkennungs- und Transkriptionslösung bereit, die auf </w:t>
+      </w:r>
+      <w:proofErr w:type="spellStart"/>
+      <w:r>
+        <w:t>OpenAI's</w:t>
+      </w:r>
+      <w:proofErr w:type="spellEnd"/>
+      <w:r>
+        <w:t xml:space="preserve"> </w:t>
+      </w:r>
+      <w:proofErr w:type="spellStart"/>
+      <w:r>
+        <w:t>Whisper</w:t>
+      </w:r>
+      <w:proofErr w:type="spellEnd"/>
+      <w:r>
+        <w:t>-Technologie basiert und nahtlos in die Word-Benutzeroberfläche integriert ist.</w:t>
       </w:r>
     </w:p>
     <w:p>
@@ -3597,7 +4079,21 @@
         <w:rPr>
           <w:b/>
         </w:rPr>
-        <w:t>Audio-Modul (ForensicWhisperDeskZH.Audio)</w:t>
+        <w:t>Audio-Modul (</w:t>
+      </w:r>
+      <w:proofErr w:type="spellStart"/>
+      <w:r>
+        <w:rPr>
+          <w:b/>
+        </w:rPr>
+        <w:t>ForensicWhisperDeskZH.Audio</w:t>
+      </w:r>
+      <w:proofErr w:type="spellEnd"/>
+      <w:r>
+        <w:rPr>
+          <w:b/>
+        </w:rPr>
+        <w:t>)</w:t>
       </w:r>
     </w:p>
     <w:p>
@@ -3640,7 +4136,21 @@
         <w:rPr>
           <w:bCs/>
         </w:rPr>
-        <w:t xml:space="preserve"> ein Audio Diagnose Tool für Debugging Zwecke. Vor der Einführung von WASAPI wurde WaveIn Event verwendet, was zu häufigen Problemen geführt hat und das Audio </w:t>
+        <w:t xml:space="preserve"> ein Audio Diagnose Tool für Debugging Zwecke. Vor der Einführung von WASAPI wurde </w:t>
+      </w:r>
+      <w:proofErr w:type="spellStart"/>
+      <w:r>
+        <w:rPr>
+          <w:bCs/>
+        </w:rPr>
+        <w:t>WaveIn</w:t>
+      </w:r>
+      <w:proofErr w:type="spellEnd"/>
+      <w:r>
+        <w:rPr>
+          <w:bCs/>
+        </w:rPr>
+        <w:t xml:space="preserve"> Event verwendet, was zu häufigen Problemen geführt hat und das Audio </w:t>
       </w:r>
       <w:r>
         <w:rPr>
@@ -3652,7 +4162,21 @@
         <w:rPr>
           <w:bCs/>
         </w:rPr>
-        <w:t xml:space="preserve"> Tool notwendig machte. Mittlerweile sollte das Audio Modul stabil genug sein ohne dieses auszukommen, </w:t>
+        <w:t xml:space="preserve"> Tool notwendig machte. Mittlerweile sollte das Audio Modul stabil genug </w:t>
+      </w:r>
+      <w:proofErr w:type="gramStart"/>
+      <w:r>
+        <w:rPr>
+          <w:bCs/>
+        </w:rPr>
+        <w:t>sein</w:t>
+      </w:r>
+      <w:proofErr w:type="gramEnd"/>
+      <w:r>
+        <w:rPr>
+          <w:bCs/>
+        </w:rPr>
+        <w:t xml:space="preserve"> ohne dieses auszukommen, </w:t>
       </w:r>
       <w:r>
         <w:rPr>
@@ -3694,7 +4218,21 @@
         <w:rPr>
           <w:b/>
         </w:rPr>
-        <w:t>ument-Modul (ForensicWhisperDeskZH.Document)</w:t>
+        <w:t>ument-Modul (</w:t>
+      </w:r>
+      <w:proofErr w:type="spellStart"/>
+      <w:r>
+        <w:rPr>
+          <w:b/>
+        </w:rPr>
+        <w:t>ForensicWhisperDeskZH.Document</w:t>
+      </w:r>
+      <w:proofErr w:type="spellEnd"/>
+      <w:r>
+        <w:rPr>
+          <w:b/>
+        </w:rPr>
+        <w:t>)</w:t>
       </w:r>
     </w:p>
     <w:p>
@@ -3713,7 +4251,21 @@
         <w:rPr>
           <w:bCs/>
         </w:rPr>
-        <w:t>stellt die Word Dokument Integration dar, und ist zuständig für die Kommunikation zwischen dem AddIn und Word. Das Modul handelt das Einfügen des Textes an der Cursor Position und stellt sicher, dass das Dokument verfügbar ist.</w:t>
+        <w:t xml:space="preserve">stellt die Word Dokument Integration dar, und ist zuständig für die Kommunikation zwischen dem </w:t>
+      </w:r>
+      <w:proofErr w:type="spellStart"/>
+      <w:r>
+        <w:rPr>
+          <w:bCs/>
+        </w:rPr>
+        <w:t>AddIn</w:t>
+      </w:r>
+      <w:proofErr w:type="spellEnd"/>
+      <w:r>
+        <w:rPr>
+          <w:bCs/>
+        </w:rPr>
+        <w:t xml:space="preserve"> und Word. Das Modul handelt das Einfügen des Textes an der Cursor Position und stellt sicher, dass das Dokument verfügbar ist.</w:t>
       </w:r>
     </w:p>
     <w:p>
@@ -3731,7 +4283,21 @@
         <w:rPr>
           <w:b/>
         </w:rPr>
-        <w:t>Transkription-Modul (ForensicWhisperDeskZH.Transcription)</w:t>
+        <w:t>Transkription-Modul (</w:t>
+      </w:r>
+      <w:proofErr w:type="spellStart"/>
+      <w:r>
+        <w:rPr>
+          <w:b/>
+        </w:rPr>
+        <w:t>ForensicWhisperDeskZH.Transcription</w:t>
+      </w:r>
+      <w:proofErr w:type="spellEnd"/>
+      <w:r>
+        <w:rPr>
+          <w:b/>
+        </w:rPr>
+        <w:t>)</w:t>
       </w:r>
     </w:p>
     <w:p>
@@ -3744,7 +4310,35 @@
         <w:rPr>
           <w:bCs/>
         </w:rPr>
-        <w:t>Das Transkriptionsmodul agiert als Interface zu den WhisperModellen und ist auf Whisper.Net aufgebaut. Es erlaubt das Management und das Downloaden von Whisper Modellen</w:t>
+        <w:t xml:space="preserve">Das Transkriptionsmodul agiert als Interface zu den </w:t>
+      </w:r>
+      <w:proofErr w:type="spellStart"/>
+      <w:r>
+        <w:rPr>
+          <w:bCs/>
+        </w:rPr>
+        <w:t>WhisperModellen</w:t>
+      </w:r>
+      <w:proofErr w:type="spellEnd"/>
+      <w:r>
+        <w:rPr>
+          <w:bCs/>
+        </w:rPr>
+        <w:t xml:space="preserve"> und ist auf Whisper.Net aufgebaut. Es erlaubt das Management und das Downloaden von </w:t>
+      </w:r>
+      <w:proofErr w:type="spellStart"/>
+      <w:r>
+        <w:rPr>
+          <w:bCs/>
+        </w:rPr>
+        <w:t>Whisper</w:t>
+      </w:r>
+      <w:proofErr w:type="spellEnd"/>
+      <w:r>
+        <w:rPr>
+          <w:bCs/>
+        </w:rPr>
+        <w:t xml:space="preserve"> Modellen</w:t>
       </w:r>
     </w:p>
     <w:p>
@@ -3764,6 +4358,7 @@
         </w:rPr>
         <w:t>Text-Modul (</w:t>
       </w:r>
+      <w:proofErr w:type="spellStart"/>
       <w:r>
         <w:rPr>
           <w:b/>
@@ -3771,6 +4366,7 @@
         </w:rPr>
         <w:t>ForensicWhisperDeskZH.Text</w:t>
       </w:r>
+      <w:proofErr w:type="spellEnd"/>
       <w:r>
         <w:rPr>
           <w:b/>
@@ -3828,7 +4424,21 @@
         <w:rPr>
           <w:b/>
         </w:rPr>
-        <w:t>Common-Modul (ForensicWhisperDeskZH.Common)</w:t>
+        <w:t>Common-Modul (</w:t>
+      </w:r>
+      <w:proofErr w:type="spellStart"/>
+      <w:r>
+        <w:rPr>
+          <w:b/>
+        </w:rPr>
+        <w:t>ForensicWhisperDeskZH.Common</w:t>
+      </w:r>
+      <w:proofErr w:type="spellEnd"/>
+      <w:r>
+        <w:rPr>
+          <w:b/>
+        </w:rPr>
+        <w:t>)</w:t>
       </w:r>
     </w:p>
     <w:p>
@@ -3859,7 +4469,21 @@
         <w:rPr>
           <w:bCs/>
         </w:rPr>
-        <w:t xml:space="preserve"> über JSON und XML, den Logging-Service sowie weiter Hilfs- und Utilities-Aufgaben zuständig.</w:t>
+        <w:t xml:space="preserve"> über JSON und XML, den </w:t>
+      </w:r>
+      <w:proofErr w:type="spellStart"/>
+      <w:r>
+        <w:rPr>
+          <w:bCs/>
+        </w:rPr>
+        <w:t>Logging</w:t>
+      </w:r>
+      <w:proofErr w:type="spellEnd"/>
+      <w:r>
+        <w:rPr>
+          <w:bCs/>
+        </w:rPr>
+        <w:t>-Service sowie weiter Hilfs- und Utilities-Aufgaben zuständig.</w:t>
       </w:r>
     </w:p>
     <w:p>
@@ -3878,17 +4502,47 @@
           <w:bCs/>
         </w:rPr>
       </w:pPr>
+      <w:proofErr w:type="spellStart"/>
       <w:r>
         <w:rPr>
           <w:b/>
         </w:rPr>
         <w:t>AddInViewModel</w:t>
       </w:r>
-      <w:r>
-        <w:rPr>
-          <w:bCs/>
-        </w:rPr>
-        <w:t>: Die zentrale Koordinationsschicht des Add-Ins, die als MVVM-Pattern implementiert ist. Orchestriert die Interaktion zwischen Transkription, Dokumentbearbeitung und UI. Unterstützt sowohl kontinuierliche Transkription als auch einen "Listening Mode" mit Trigger-Phrasen ("diktat starten"/"diktat beenden").</w:t>
+      <w:proofErr w:type="spellEnd"/>
+      <w:r>
+        <w:rPr>
+          <w:bCs/>
+        </w:rPr>
+        <w:t>: Die zentrale Koordinationsschicht des Add-Ins, die als MVVM-Pattern implementiert ist. Orchestriert die Interaktion zwischen Transkription, Dokumentbearbeitung und UI. Unterstützt sowohl kontinuierliche Transkription als auch einen "Listening Mode" mit Trigger-Phrasen ("</w:t>
+      </w:r>
+      <w:proofErr w:type="spellStart"/>
+      <w:r>
+        <w:rPr>
+          <w:bCs/>
+        </w:rPr>
+        <w:t>diktat</w:t>
+      </w:r>
+      <w:proofErr w:type="spellEnd"/>
+      <w:r>
+        <w:rPr>
+          <w:bCs/>
+        </w:rPr>
+        <w:t xml:space="preserve"> starten"/"</w:t>
+      </w:r>
+      <w:proofErr w:type="spellStart"/>
+      <w:r>
+        <w:rPr>
+          <w:bCs/>
+        </w:rPr>
+        <w:t>diktat</w:t>
+      </w:r>
+      <w:proofErr w:type="spellEnd"/>
+      <w:r>
+        <w:rPr>
+          <w:bCs/>
+        </w:rPr>
+        <w:t xml:space="preserve"> beenden").</w:t>
       </w:r>
     </w:p>
     <w:p>
@@ -3897,45 +4551,93 @@
           <w:bCs/>
         </w:rPr>
       </w:pPr>
+      <w:proofErr w:type="spellStart"/>
       <w:r>
         <w:rPr>
           <w:b/>
         </w:rPr>
-        <w:t>TranscriptionSettings:</w:t>
-      </w:r>
-      <w:r>
-        <w:rPr>
-          <w:bCs/>
-        </w:rPr>
-        <w:t xml:space="preserve"> Umfassende Konfigurationsklasse für alle Aspekte der Spracherkennung, einschließlich Audio-Parameter, Whisper-Model-Einstellungen, Sprach-Optionen und Text-Verarbeitungsregeln.</w:t>
+        <w:t>TranscriptionSettings</w:t>
+      </w:r>
+      <w:proofErr w:type="spellEnd"/>
+      <w:r>
+        <w:rPr>
+          <w:b/>
+        </w:rPr>
+        <w:t>:</w:t>
+      </w:r>
+      <w:r>
+        <w:rPr>
+          <w:bCs/>
+        </w:rPr>
+        <w:t xml:space="preserve"> Umfassende Konfigurationsklasse für alle Aspekte der Spracherkennung, einschließlich Audio-Parameter, </w:t>
+      </w:r>
+      <w:proofErr w:type="spellStart"/>
+      <w:r>
+        <w:rPr>
+          <w:bCs/>
+        </w:rPr>
+        <w:t>Whisper</w:t>
+      </w:r>
+      <w:proofErr w:type="spellEnd"/>
+      <w:r>
+        <w:rPr>
+          <w:bCs/>
+        </w:rPr>
+        <w:t>-Model-Einstellungen, Sprach-Optionen und Text-Verarbeitungsregeln.</w:t>
       </w:r>
     </w:p>
     <w:p>
       <w:pPr>
         <w:rPr>
+          <w:bCs/>
+        </w:rPr>
+      </w:pPr>
+      <w:proofErr w:type="spellStart"/>
+      <w:r>
+        <w:rPr>
           <w:b/>
         </w:rPr>
-      </w:pPr>
+        <w:t>MainRibbon</w:t>
+      </w:r>
+      <w:proofErr w:type="spellEnd"/>
       <w:r>
         <w:rPr>
           <w:b/>
         </w:rPr>
-        <w:t>MainRibbon:</w:t>
-      </w:r>
-      <w:r>
-        <w:rPr>
-          <w:bCs/>
-        </w:rPr>
-        <w:t xml:space="preserve"> Word-Ribbon-Integration für die Benutzeroberfläche mit Buttons für Start/Stop, Einstellungen, Mikrofonauswahl und Model-Konfiguration.</w:t>
-      </w:r>
+        <w:t>:</w:t>
+      </w:r>
+      <w:r>
+        <w:rPr>
+          <w:bCs/>
+        </w:rPr>
+        <w:t xml:space="preserve"> Word-Ribbon-Integration für die Benutzeroberfläche mit Buttons für Start/</w:t>
+      </w:r>
+      <w:proofErr w:type="spellStart"/>
+      <w:r>
+        <w:rPr>
+          <w:bCs/>
+        </w:rPr>
+        <w:t>Stop</w:t>
+      </w:r>
+      <w:proofErr w:type="spellEnd"/>
+      <w:r>
+        <w:rPr>
+          <w:bCs/>
+        </w:rPr>
+        <w:t>, Einstellungen, Mikrofonauswahl und Model-Konfiguration.</w:t>
+      </w:r>
+      <w:bookmarkStart w:id="17" w:name="_Toc207199929"/>
     </w:p>
     <w:p>
-      <w:bookmarkStart w:id="17" w:name="_Toc207199929"/>
+      <w:pPr>
+        <w:pStyle w:val="Heading2"/>
+      </w:pPr>
       <w:r>
         <w:t>Bird Eye View</w:t>
       </w:r>
       <w:bookmarkEnd w:id="17"/>
     </w:p>
+    <w:p/>
     <w:p>
       <w:pPr>
         <w:pStyle w:val="Heading2"/>
@@ -3946,6 +4648,7 @@
       </w:r>
       <w:bookmarkEnd w:id="18"/>
     </w:p>
+    <w:p/>
     <w:p>
       <w:pPr>
         <w:pStyle w:val="Heading1"/>
@@ -3958,9 +4661,18 @@
         <w:rPr>
           <w:lang w:val="de-CH"/>
         </w:rPr>
-        <w:t>Architektur ModelDownloader</w:t>
+        <w:lastRenderedPageBreak/>
+        <w:t xml:space="preserve">Architektur </w:t>
+      </w:r>
+      <w:proofErr w:type="spellStart"/>
+      <w:r>
+        <w:rPr>
+          <w:lang w:val="de-CH"/>
+        </w:rPr>
+        <w:t>ModelDownloader</w:t>
       </w:r>
       <w:bookmarkEnd w:id="19"/>
+      <w:proofErr w:type="spellEnd"/>
     </w:p>
     <w:p>
       <w:pPr>
@@ -4007,9 +4719,17 @@
         <w:rPr>
           <w:lang w:val="de-CH"/>
         </w:rPr>
-        <w:t xml:space="preserve"> ForensicWhisperDeskZH</w:t>
+        <w:t xml:space="preserve"> </w:t>
+      </w:r>
+      <w:proofErr w:type="spellStart"/>
+      <w:r>
+        <w:rPr>
+          <w:lang w:val="de-CH"/>
+        </w:rPr>
+        <w:t>ForensicWhisperDeskZH</w:t>
       </w:r>
       <w:bookmarkEnd w:id="22"/>
+      <w:proofErr w:type="spellEnd"/>
       <w:r>
         <w:rPr>
           <w:lang w:val="de-CH"/>
@@ -4030,9 +4750,17 @@
         <w:rPr>
           <w:lang w:val="de-CH"/>
         </w:rPr>
-        <w:t>Flow ModelDownloader</w:t>
+        <w:t xml:space="preserve">Flow </w:t>
+      </w:r>
+      <w:proofErr w:type="spellStart"/>
+      <w:r>
+        <w:rPr>
+          <w:lang w:val="de-CH"/>
+        </w:rPr>
+        <w:t>ModelDownloader</w:t>
       </w:r>
       <w:bookmarkEnd w:id="24"/>
+      <w:proofErr w:type="spellEnd"/>
     </w:p>
     <w:p>
       <w:pPr>
@@ -4042,11 +4770,19 @@
         </w:rPr>
       </w:pPr>
       <w:bookmarkStart w:id="25" w:name="_Toc207199936"/>
+      <w:proofErr w:type="spellStart"/>
       <w:r>
         <w:rPr>
           <w:lang w:val="de-CH"/>
         </w:rPr>
-        <w:t>GitHubActions Pipeline</w:t>
+        <w:t>GitHubActions</w:t>
+      </w:r>
+      <w:proofErr w:type="spellEnd"/>
+      <w:r>
+        <w:rPr>
+          <w:lang w:val="de-CH"/>
+        </w:rPr>
+        <w:t xml:space="preserve"> Pipeline</w:t>
       </w:r>
       <w:bookmarkEnd w:id="25"/>
     </w:p>
@@ -4228,7 +4964,7 @@
         <w:rFonts w:ascii="Wingdings" w:hAnsi="Wingdings" w:hint="default"/>
       </w:rPr>
     </w:lvl>
-    <w:lvl w:ilvl="1" w:tplc="20000003" w:tentative="1">
+    <w:lvl w:ilvl="1" w:tplc="20000003">
       <w:start w:val="1"/>
       <w:numFmt w:val="bullet"/>
       <w:lvlText w:val="o"/>

</xml_diff>